<commit_message>
De-identificazione dei nomi nel riassunto AI dei report
Il riassunto automatico dei report ('Genera Insight') spediva al fornitore
del modello l'intero oggetto report, con nomi e cognomi degli atleti nelle
tabelle piu' metadata.athleteName e metadata.generatedBy. Ora ogni nome noto
diventa un'etichetta prima dell'invio e torna nome vero nella risposta,
riusando createPseudonymizer() gia' in uso su chat e coach.

Informativa privacy (it/en/es): la clausola sui fornitori IA passa da 'ove
necessario i dati sono minimizzati o pseudonimizzati' allo stato reale, con
l'eccezione esplicita del testo digitato dall'utente in chat.

Registro art.30 v1.1: T3 allineato, e provider hosting corretto da Hetzner
a IONOS (anche in Guida assicurazione e TODO legale).
</commit_message>
<xml_diff>
--- a/legal/Guida_Assicurazione_RC_Tech_E_O_IT.docx
+++ b/legal/Guida_Assicurazione_RC_Tech_E_O_IT.docx
@@ -1299,17 +1299,7 @@
         <w:spacing w:after="80" w:line="300"/>
       </w:pPr>
       <w:r>
-        <w:t xml:space="preserve">3. Verifica </w:t>
-      </w:r>
-      <w:r>
-        <w:rPr>
-          <w:b/>
-          <w:bCs/>
-        </w:rPr>
-        <w:t xml:space="preserve">compliance dei fornitori chiave</w:t>
-      </w:r>
-      <w:r>
-        <w:t xml:space="preserve"> (Stripe/Hetzner/OpenAI/Anthropic hanno certificazioni SOC2/ISO27001 — utile per ridurre il premio).</w:t>
+        <w:t>3. Verifica compliance dei fornitori chiave (Stripe/IONOS/OpenAI/Anthropic hanno certificazioni SOC2/ISO27001 — utile per ridurre il premio).</w:t>
       </w:r>
     </w:p>
     <w:p>

</xml_diff>